<commit_message>
CV 2026: usar la foto nueva de perfil
Co-Authored-By: Claude Opus 5.5 <noreply@anthropic.com>
Claude-Session: https://claude.ai/code/session_01FgYAHAAVVDSaobr1dAS4Mt
</commit_message>
<xml_diff>
--- a/asset/cvx/2026/CV_JAPC_2026_Clases_Universidad.docx
+++ b/asset/cvx/2026/CV_JAPC_2026_Clases_Universidad.docx
@@ -74,7 +74,7 @@
             <w:pPr>
               <w:spacing w:after="20"/>
             </w:pPr>
-            <w:hyperlink w:history="1" r:id="rIdvk23fiq5d2mhdgukfn0mb">
+            <w:hyperlink w:history="1" r:id="rIdq37yytv9tjolfby1_rkvf">
               <w:r>
                 <w:rPr>
                   <w:rFonts w:ascii="Calibri" w:cs="Calibri" w:eastAsia="Calibri" w:hAnsi="Calibri"/>
@@ -106,7 +106,7 @@
             <w:r>
               <w:drawing>
                 <wp:inline distT="0" distB="0" distL="0" distR="0">
-                  <wp:extent cx="914400" cy="990600"/>
+                  <wp:extent cx="952500" cy="952500"/>
                   <wp:effectExtent t="0" r="0" b="0" l="0"/>
                   <wp:docPr id="3" name="" descr="" title=""/>
                   <wp:cNvGraphicFramePr>
@@ -131,7 +131,7 @@
                         <pic:spPr bwMode="auto">
                           <a:xfrm>
                             <a:off x="0" y="0"/>
-                            <a:ext cx="914400" cy="990600"/>
+                            <a:ext cx="952500" cy="952500"/>
                           </a:xfrm>
                           <a:prstGeom prst="rect">
                             <a:avLst/>

</xml_diff>